<commit_message>
deatail project doc added
</commit_message>
<xml_diff>
--- a/templates/report/template.docx
+++ b/templates/report/template.docx
@@ -419,12 +419,12 @@
       </w:pPr>
       <w:r>
         <w:rPr>
-          <w:b/>
+          <w:b w:val="0"/>
           <w:sz w:val="26"/>
           <w:szCs w:val="26"/>
           <w:rtl w:val="0"/>
         </w:rPr>
-        <w:t>Event: “{{ event_title }}”</w:t>
+        <w:t>{{ introduction }}</w:t>
       </w:r>
       <w:r>
         <w:rPr>
@@ -610,12 +610,12 @@
       </w:pPr>
       <w:r>
         <w:rPr>
-          <w:b/>
-          <w:sz w:val="28"/>
-          <w:szCs w:val="28"/>
-          <w:rtl w:val="0"/>
-        </w:rPr>
-        <w:t>Event: “{{ event_title }}”</w:t>
+          <w:b w:val="0"/>
+          <w:sz w:val="28"/>
+          <w:szCs w:val="28"/>
+          <w:rtl w:val="0"/>
+        </w:rPr>
+        <w:t>{{ discussion }}</w:t>
       </w:r>
       <w:r>
         <w:rPr>
@@ -797,25 +797,22 @@
           <w:szCs w:val="28"/>
           <w:rtl w:val="0"/>
         </w:rPr>
-        <w:t xml:space="preserve">Overall, the session provided participants with a practical introduction to </w:t>
-      </w:r>
-      <w:r>
-        <w:rPr>
-          <w:b w:val="1"/>
-          <w:bCs w:val="1"/>
-          <w:sz w:val="28"/>
-          <w:szCs w:val="28"/>
-          <w:rtl w:val="0"/>
-        </w:rPr>
-        <w:t xml:space="preserve">AI tools, Prompt Engineering, AI-powered workflows, and the integration of AI with Civil Engineering</w:t>
-      </w:r>
-      <w:r>
-        <w:rPr>
-          <w:sz w:val="28"/>
-          <w:szCs w:val="28"/>
-          <w:rtl w:val="0"/>
-        </w:rPr>
-        <w:t xml:space="preserve">, encouraging them to explore emerging AI technologies and their real-world applications in the engineering domain.</w:t>
+      </w:r>
+      <w:r>
+        <w:rPr>
+          <w:b w:val="1"/>
+          <w:bCs w:val="1"/>
+          <w:sz w:val="28"/>
+          <w:szCs w:val="28"/>
+          <w:rtl w:val="0"/>
+        </w:rPr>
+      </w:r>
+      <w:r>
+        <w:rPr>
+          <w:sz w:val="28"/>
+          <w:szCs w:val="28"/>
+          <w:rtl w:val="0"/>
+        </w:rPr>
       </w:r>
       <w:r>
         <w:rPr>
@@ -851,12 +848,12 @@
       </w:pPr>
       <w:r>
         <w:rPr>
-          <w:b/>
-          <w:sz w:val="28"/>
-          <w:szCs w:val="28"/>
-          <w:rtl w:val="0"/>
-        </w:rPr>
-        <w:t>Event: “{{ event_title }}”</w:t>
+          <w:b w:val="0"/>
+          <w:sz w:val="28"/>
+          <w:szCs w:val="28"/>
+          <w:rtl w:val="0"/>
+        </w:rPr>
+        <w:t>{{ conclusion }}</w:t>
       </w:r>
       <w:r>
         <w:rPr>
@@ -991,7 +988,6 @@
           <w:iCs w:val="1"/>
           <w:rtl w:val="0"/>
         </w:rPr>
-        <w:t>{{ photo_1_caption }}</w:t>
       </w:r>
     </w:p>
     <w:p>
@@ -1091,7 +1087,6 @@
           <w:iCs w:val="1"/>
           <w:rtl w:val="0"/>
         </w:rPr>
-        <w:t>{{ photo_2_caption }}</w:t>
       </w:r>
     </w:p>
     <w:p>
@@ -1196,7 +1191,6 @@
           <w:iCs w:val="1"/>
           <w:rtl w:val="0"/>
         </w:rPr>
-        <w:t xml:space="preserve">Speaker solving Douts of Students</w:t>
       </w:r>
     </w:p>
     <w:p>
@@ -1285,7 +1279,6 @@
           <w:iCs w:val="1"/>
           <w:rtl w:val="0"/>
         </w:rPr>
-        <w:t xml:space="preserve">Winner Of Mentimeter Quiz Competition</w:t>
       </w:r>
       <w:r>
         <w:rPr>
@@ -1344,7 +1337,6 @@
           <w:szCs w:val="28"/>
           <w:rtl w:val="0"/>
         </w:rPr>
-        <w:t xml:space="preserve">                Mr. Vijesh Nair                                                                      Dr. Jaya Gupta</w:t>
       </w:r>
       <w:r>
         <w:rPr>
@@ -1373,9 +1365,6 @@
           <w:szCs w:val="28"/>
           <w:rtl w:val="0"/>
         </w:rPr>
-        <w:t xml:space="preserve">Departmental Coordinator</w:t>
-        <w:tab/>
-        <w:t xml:space="preserve">Head of Department</w:t>
       </w:r>
       <w:r>
         <w:rPr>

</xml_diff>